<commit_message>
Update bio and website profile
</commit_message>
<xml_diff>
--- a/bio.docx
+++ b/bio.docx
@@ -30,7 +30,7 @@
           <w:bCs/>
         </w:rPr>
         <w:pict w14:anchorId="4BA51C98">
-          <v:rect id="_x0000_i1259" style="width:0;height:1.5pt" o:hralign="center" o:hrstd="t" o:hr="t" fillcolor="#a0a0a0" stroked="f"/>
+          <v:rect id="_x0000_i1025" style="width:0;height:1.5pt" o:hralign="center" o:hrstd="t" o:hr="t" fillcolor="#a0a0a0" stroked="f"/>
         </w:pict>
       </w:r>
     </w:p>
@@ -61,7 +61,15 @@
           <w:b/>
           <w:bCs/>
         </w:rPr>
-        <w:t>Full Name: Dr. Alex Chen</w:t>
+        <w:t xml:space="preserve">Full Name: Dr. Alex </w:t>
+      </w:r>
+      <w:r>
+        <w:rPr>
+          <w:rFonts w:hint="eastAsia"/>
+          <w:b/>
+          <w:bCs/>
+        </w:rPr>
+        <w:t>Wang</w:t>
       </w:r>
       <w:r>
         <w:rPr>
@@ -181,7 +189,7 @@
           <w:bCs/>
         </w:rPr>
         <w:pict w14:anchorId="1846C0B3">
-          <v:rect id="_x0000_i1260" style="width:0;height:1.5pt" o:hralign="center" o:hrstd="t" o:hr="t" fillcolor="#a0a0a0" stroked="f"/>
+          <v:rect id="_x0000_i1026" style="width:0;height:1.5pt" o:hralign="center" o:hrstd="t" o:hr="t" fillcolor="#a0a0a0" stroked="f"/>
         </w:pict>
       </w:r>
     </w:p>
@@ -228,7 +236,7 @@
           <w:bCs/>
         </w:rPr>
         <w:pict w14:anchorId="6D5B4AEC">
-          <v:rect id="_x0000_i1261" style="width:0;height:1.5pt" o:hralign="center" o:hrstd="t" o:hr="t" fillcolor="#a0a0a0" stroked="f"/>
+          <v:rect id="_x0000_i1027" style="width:0;height:1.5pt" o:hralign="center" o:hrstd="t" o:hr="t" fillcolor="#a0a0a0" stroked="f"/>
         </w:pict>
       </w:r>
     </w:p>
@@ -355,7 +363,7 @@
           <w:bCs/>
         </w:rPr>
         <w:pict w14:anchorId="62562CE7">
-          <v:rect id="_x0000_i1262" style="width:0;height:1.5pt" o:hralign="center" o:hrstd="t" o:hr="t" fillcolor="#a0a0a0" stroked="f"/>
+          <v:rect id="_x0000_i1028" style="width:0;height:1.5pt" o:hralign="center" o:hrstd="t" o:hr="t" fillcolor="#a0a0a0" stroked="f"/>
         </w:pict>
       </w:r>
     </w:p>
@@ -472,7 +480,7 @@
           <w:bCs/>
         </w:rPr>
         <w:pict w14:anchorId="1F058CC9">
-          <v:rect id="_x0000_i1263" style="width:0;height:1.5pt" o:hralign="center" o:hrstd="t" o:hr="t" fillcolor="#a0a0a0" stroked="f"/>
+          <v:rect id="_x0000_i1029" style="width:0;height:1.5pt" o:hralign="center" o:hrstd="t" o:hr="t" fillcolor="#a0a0a0" stroked="f"/>
         </w:pict>
       </w:r>
     </w:p>
@@ -535,7 +543,7 @@
           <w:bCs/>
         </w:rPr>
         <w:pict w14:anchorId="32F6BFF4">
-          <v:rect id="_x0000_i1264" style="width:0;height:1.5pt" o:hralign="center" o:hrstd="t" o:hr="t" fillcolor="#a0a0a0" stroked="f"/>
+          <v:rect id="_x0000_i1030" style="width:0;height:1.5pt" o:hralign="center" o:hrstd="t" o:hr="t" fillcolor="#a0a0a0" stroked="f"/>
         </w:pict>
       </w:r>
     </w:p>
@@ -655,7 +663,7 @@
           <w:bCs/>
         </w:rPr>
         <w:pict w14:anchorId="3F2ED1AD">
-          <v:rect id="_x0000_i1265" style="width:0;height:1.5pt" o:hralign="center" o:hrstd="t" o:hr="t" fillcolor="#a0a0a0" stroked="f"/>
+          <v:rect id="_x0000_i1031" style="width:0;height:1.5pt" o:hralign="center" o:hrstd="t" o:hr="t" fillcolor="#a0a0a0" stroked="f"/>
         </w:pict>
       </w:r>
     </w:p>
@@ -861,7 +869,7 @@
           <w:bCs/>
         </w:rPr>
         <w:pict w14:anchorId="022EB21E">
-          <v:rect id="_x0000_i1266" style="width:0;height:1.5pt" o:hralign="center" o:hrstd="t" o:hr="t" fillcolor="#a0a0a0" stroked="f"/>
+          <v:rect id="_x0000_i1032" style="width:0;height:1.5pt" o:hralign="center" o:hrstd="t" o:hr="t" fillcolor="#a0a0a0" stroked="f"/>
         </w:pict>
       </w:r>
     </w:p>
@@ -971,7 +979,7 @@
           <w:bCs/>
         </w:rPr>
         <w:pict w14:anchorId="5473DB53">
-          <v:rect id="_x0000_i1267" style="width:0;height:1.5pt" o:hralign="center" o:hrstd="t" o:hr="t" fillcolor="#a0a0a0" stroked="f"/>
+          <v:rect id="_x0000_i1033" style="width:0;height:1.5pt" o:hralign="center" o:hrstd="t" o:hr="t" fillcolor="#a0a0a0" stroked="f"/>
         </w:pict>
       </w:r>
     </w:p>
@@ -1026,7 +1034,7 @@
           <w:bCs/>
         </w:rPr>
         <w:pict w14:anchorId="7BB1E25B">
-          <v:rect id="_x0000_i1268" style="width:0;height:1.5pt" o:hralign="center" o:hrstd="t" o:hr="t" fillcolor="#a0a0a0" stroked="f"/>
+          <v:rect id="_x0000_i1034" style="width:0;height:1.5pt" o:hralign="center" o:hrstd="t" o:hr="t" fillcolor="#a0a0a0" stroked="f"/>
         </w:pict>
       </w:r>
     </w:p>
@@ -1105,7 +1113,7 @@
           <w:bCs/>
         </w:rPr>
         <w:pict w14:anchorId="7245C0C8">
-          <v:rect id="_x0000_i1269" style="width:0;height:1.5pt" o:hralign="center" o:hrstd="t" o:hr="t" fillcolor="#a0a0a0" stroked="f"/>
+          <v:rect id="_x0000_i1035" style="width:0;height:1.5pt" o:hralign="center" o:hrstd="t" o:hr="t" fillcolor="#a0a0a0" stroked="f"/>
         </w:pict>
       </w:r>
     </w:p>
@@ -1176,7 +1184,7 @@
         </w:rPr>
         <w:lastRenderedPageBreak/>
         <w:pict w14:anchorId="79019F14">
-          <v:rect id="_x0000_i1270" style="width:0;height:1.5pt" o:hralign="center" o:hrstd="t" o:hr="t" fillcolor="#a0a0a0" stroked="f"/>
+          <v:rect id="_x0000_i1036" style="width:0;height:1.5pt" o:hralign="center" o:hrstd="t" o:hr="t" fillcolor="#a0a0a0" stroked="f"/>
         </w:pict>
       </w:r>
     </w:p>
@@ -1231,7 +1239,7 @@
           <w:bCs/>
         </w:rPr>
         <w:pict w14:anchorId="4E40CE28">
-          <v:rect id="_x0000_i1271" style="width:0;height:1.5pt" o:hralign="center" o:hrstd="t" o:hr="t" fillcolor="#a0a0a0" stroked="f"/>
+          <v:rect id="_x0000_i1037" style="width:0;height:1.5pt" o:hralign="center" o:hrstd="t" o:hr="t" fillcolor="#a0a0a0" stroked="f"/>
         </w:pict>
       </w:r>
     </w:p>
@@ -2933,6 +2941,7 @@
   <w:style w:type="character" w:default="1" w:styleId="DefaultParagraphFont">
     <w:name w:val="Default Paragraph Font"/>
     <w:uiPriority w:val="1"/>
+    <w:semiHidden/>
     <w:unhideWhenUsed/>
   </w:style>
   <w:style w:type="table" w:default="1" w:styleId="TableNormal">

</xml_diff>